<commit_message>
docs: alinha Casos de Uso e Plano de Projeto ao codigo implementado
Mantem o codigo como fonte da verdade e corrige as divergencias nos documentos:
- UC1: remove busca por autor (nao implementada) da descricao, fluxo e ficha
- RN1.6: capitulos priorizam pt-BR > ingles > idioma original (ja/ko, p/ UC4)
- RN3.2/FA1: nome de colecao de 2 a 40 caracteres; remove 'cor' (nao implementada)
- RN3.3/4.1: quatro colecoes padrao, incluindo 'Favoritos'
- Plano: exemplos de Service/Model com os nomes reais das classes

Co-Authored-By: Claude Opus 4.8 <noreply@anthropic.com>
</commit_message>
<xml_diff>
--- a/docs/Casos_de_Uso.docx
+++ b/docs/Casos_de_Uso.docx
@@ -1627,7 +1627,7 @@
     </w:p>
     <w:p>
       <w:r>
-        <w:t xml:space="preserve">Permite ao Leitor pesquisar mangás disponíveis no catálogo do MangaDex utilizando filtros por título, gênero e autor, visualizar resultados paginados e abrir a ficha completa de um mangá específico, contendo capa, sinopse, autor, status (em andamento, concluído, hiato), gêneros e lista de capítulos disponíveis.</w:t>
+        <w:t xml:space="preserve">Permite ao Leitor pesquisar mangás disponíveis no catálogo do MangaDex utilizando filtros por título e gênero, visualizar resultados paginados e abrir a ficha completa de um mangá específico, contendo capa, sinopse, status (em andamento, concluído, hiato), gêneros e lista de capítulos disponíveis.</w:t>
       </w:r>
     </w:p>
     <w:p>
@@ -1749,7 +1749,7 @@
         </w:numPr>
       </w:pPr>
       <w:r>
-        <w:t xml:space="preserve">O Leitor opcionalmente seleciona filtros de gênero e autor.</w:t>
+        <w:t xml:space="preserve">O Leitor opcionalmente seleciona filtros de gênero.</w:t>
       </w:r>
     </w:p>
     <w:p>
@@ -2657,7 +2657,7 @@
                 <w:sz w:val="22"/>
                 <w:szCs w:val="22"/>
               </w:rPr>
-              <w:t xml:space="preserve">A busca deve filtrar capítulos por idioma preferido configurado pelo Leitor (pt-BR como padrão, com fallback para en).</w:t>
+              <w:t xml:space="preserve">A busca deve listar capítulos priorizando pt-BR, depois inglês e, por fim, o idioma original (ja/ko) — estes para tradução no UC4.</w:t>
             </w:r>
           </w:p>
         </w:tc>
@@ -5035,7 +5035,7 @@
     </w:p>
     <w:p>
       <w:r>
-        <w:t xml:space="preserve">Permite ao Leitor organizar uma biblioteca pessoal de mangás favoritos, agrupar mangás em coleções nomeadas (ex.: "Lendo", "Concluídos", "Quero ler"), consultar o histórico cronológico de leitura, marcar progresso e gerar relatórios com estatísticas (capítulos lidos por período, gêneros favoritos, tempo total de leitura), com possibilidade de exportação em CSV ou PDF.</w:t>
+        <w:t xml:space="preserve">Permite ao Leitor organizar uma biblioteca pessoal de mangás favoritos, agrupar mangás em coleções nomeadas (ex.: "Favoritos", "Lendo", "Concluídos", "Quero ler"), consultar o histórico cronológico de leitura, marcar progresso e gerar relatórios com estatísticas (capítulos lidos por período, gêneros favoritos, tempo total de leitura), com possibilidade de exportação em CSV ou PDF.</w:t>
       </w:r>
     </w:p>
     <w:p>
@@ -5334,7 +5334,7 @@
     </w:p>
     <w:p>
       <w:r>
-        <w:t xml:space="preserve">No passo 2 de Adicionar à biblioteca, o Leitor pode criar uma nova coleção informando nome (entre 2 e 30 caracteres) e cor. O Sistema valida unicidade do nome.</w:t>
+        <w:t xml:space="preserve">No passo 2 de Adicionar à biblioteca, o Leitor pode criar uma nova coleção informando nome (entre 2 e 40 caracteres). O Sistema valida unicidade do nome.</w:t>
       </w:r>
     </w:p>
     <w:p>
@@ -5725,7 +5725,7 @@
                 <w:sz w:val="22"/>
                 <w:szCs w:val="22"/>
               </w:rPr>
-              <w:t xml:space="preserve">Nomes de coleção têm de 2 a 30 caracteres, não podem ser duplicados (case-insensitive).</w:t>
+              <w:t xml:space="preserve">Nomes de coleção têm de 2 a 40 caracteres, não podem ser duplicados (case-insensitive).</w:t>
             </w:r>
           </w:p>
         </w:tc>
@@ -5823,7 +5823,7 @@
                 <w:sz w:val="22"/>
                 <w:szCs w:val="22"/>
               </w:rPr>
-              <w:t xml:space="preserve">Três coleções não removíveis devem existir desde a criação do banco: "Lendo", "Concluídos", "Quero Ler".</w:t>
+              <w:t xml:space="preserve">Quatro coleções não removíveis devem existir desde a criação do banco: "Favoritos", "Lendo", "Concluídos", "Quero Ler".</w:t>
             </w:r>
           </w:p>
         </w:tc>
@@ -8909,7 +8909,7 @@
                 <w:sz w:val="22"/>
                 <w:szCs w:val="22"/>
               </w:rPr>
-              <w:t xml:space="preserve">Idiomas suportados (pt-BR / en)</w:t>
+              <w:t xml:space="preserve">Idiomas dos capítulos (pt-BR › en › original)</w:t>
             </w:r>
           </w:p>
         </w:tc>

</xml_diff>